<commit_message>
report barebones and non conclusive WPP simulation
</commit_message>
<xml_diff>
--- a/exercise7/exercise7.docx
+++ b/exercise7/exercise7.docx
@@ -135,6 +135,47 @@
           </wp:inline>
         </w:drawing>
       </w:r>
+    </w:p>
+    <w:p>
+      <w:r>
+        <w:drawing>
+          <wp:inline distT="0" distB="0" distL="0" distR="0" wp14:anchorId="0ACCC255" wp14:editId="503D42B2">
+            <wp:extent cx="5943600" cy="1939290"/>
+            <wp:effectExtent l="0" t="0" r="0" b="3810"/>
+            <wp:docPr id="10" name="Picture 10"/>
+            <wp:cNvGraphicFramePr>
+              <a:graphicFrameLocks xmlns:a="http://schemas.openxmlformats.org/drawingml/2006/main" noChangeAspect="1"/>
+            </wp:cNvGraphicFramePr>
+            <a:graphic xmlns:a="http://schemas.openxmlformats.org/drawingml/2006/main">
+              <a:graphicData uri="http://schemas.openxmlformats.org/drawingml/2006/picture">
+                <pic:pic xmlns:pic="http://schemas.openxmlformats.org/drawingml/2006/picture">
+                  <pic:nvPicPr>
+                    <pic:cNvPr id="1" name=""/>
+                    <pic:cNvPicPr/>
+                  </pic:nvPicPr>
+                  <pic:blipFill>
+                    <a:blip r:embed="rId7"/>
+                    <a:stretch>
+                      <a:fillRect/>
+                    </a:stretch>
+                  </pic:blipFill>
+                  <pic:spPr>
+                    <a:xfrm>
+                      <a:off x="0" y="0"/>
+                      <a:ext cx="5943600" cy="1939290"/>
+                    </a:xfrm>
+                    <a:prstGeom prst="rect">
+                      <a:avLst/>
+                    </a:prstGeom>
+                  </pic:spPr>
+                </pic:pic>
+              </a:graphicData>
+            </a:graphic>
+          </wp:inline>
+        </w:drawing>
+      </w:r>
+    </w:p>
+    <w:p>
       <w:r>
         <w:br/>
       </w:r>
@@ -158,7 +199,7 @@
                     <pic:cNvPicPr/>
                   </pic:nvPicPr>
                   <pic:blipFill>
-                    <a:blip r:embed="rId7"/>
+                    <a:blip r:embed="rId8"/>
                     <a:stretch>
                       <a:fillRect/>
                     </a:stretch>
@@ -187,13 +228,7 @@
         <w:t>merchandizing surplus</w:t>
       </w:r>
       <w:r>
-        <w:t xml:space="preserve"> = (5 €/MW – 1 </w:t>
-      </w:r>
-      <w:r>
-        <w:t>€/MW</w:t>
-      </w:r>
-      <w:r>
-        <w:t>)</w:t>
+        <w:t xml:space="preserve"> = (5 €/MW – 1 €/MW)</w:t>
       </w:r>
       <w:r>
         <w:t xml:space="preserve"> </w:t>
@@ -229,7 +264,7 @@
                     <pic:cNvPicPr/>
                   </pic:nvPicPr>
                   <pic:blipFill>
-                    <a:blip r:embed="rId8"/>
+                    <a:blip r:embed="rId9"/>
                     <a:stretch>
                       <a:fillRect/>
                     </a:stretch>
@@ -259,10 +294,11 @@
         <w:rPr>
           <w:noProof/>
         </w:rPr>
+        <w:lastRenderedPageBreak/>
         <w:drawing>
-          <wp:inline distT="0" distB="0" distL="0" distR="0" wp14:anchorId="6B7C1B4E" wp14:editId="13C81C7E">
-            <wp:extent cx="2381693" cy="3258488"/>
-            <wp:effectExtent l="0" t="0" r="0" b="0"/>
+          <wp:inline distT="0" distB="0" distL="0" distR="0" wp14:anchorId="6B7C1B4E" wp14:editId="1F07C79D">
+            <wp:extent cx="2832388" cy="3875101"/>
+            <wp:effectExtent l="0" t="0" r="6350" b="0"/>
             <wp:docPr id="6" name="Picture 6"/>
             <wp:cNvGraphicFramePr>
               <a:graphicFrameLocks xmlns:a="http://schemas.openxmlformats.org/drawingml/2006/main" noChangeAspect="1"/>
@@ -275,7 +311,7 @@
                     <pic:cNvPicPr/>
                   </pic:nvPicPr>
                   <pic:blipFill>
-                    <a:blip r:embed="rId9"/>
+                    <a:blip r:embed="rId10"/>
                     <a:stretch>
                       <a:fillRect/>
                     </a:stretch>
@@ -283,7 +319,44 @@
                   <pic:spPr>
                     <a:xfrm>
                       <a:off x="0" y="0"/>
-                      <a:ext cx="2386869" cy="3265569"/>
+                      <a:ext cx="2833355" cy="3876424"/>
+                    </a:xfrm>
+                    <a:prstGeom prst="rect">
+                      <a:avLst/>
+                    </a:prstGeom>
+                  </pic:spPr>
+                </pic:pic>
+              </a:graphicData>
+            </a:graphic>
+          </wp:inline>
+        </w:drawing>
+      </w:r>
+      <w:r>
+        <w:drawing>
+          <wp:inline distT="0" distB="0" distL="0" distR="0" wp14:anchorId="177B5182" wp14:editId="70F29E66">
+            <wp:extent cx="3086367" cy="3962743"/>
+            <wp:effectExtent l="0" t="0" r="0" b="0"/>
+            <wp:docPr id="5" name="Picture 5"/>
+            <wp:cNvGraphicFramePr>
+              <a:graphicFrameLocks xmlns:a="http://schemas.openxmlformats.org/drawingml/2006/main" noChangeAspect="1"/>
+            </wp:cNvGraphicFramePr>
+            <a:graphic xmlns:a="http://schemas.openxmlformats.org/drawingml/2006/main">
+              <a:graphicData uri="http://schemas.openxmlformats.org/drawingml/2006/picture">
+                <pic:pic xmlns:pic="http://schemas.openxmlformats.org/drawingml/2006/picture">
+                  <pic:nvPicPr>
+                    <pic:cNvPr id="1" name=""/>
+                    <pic:cNvPicPr/>
+                  </pic:nvPicPr>
+                  <pic:blipFill>
+                    <a:blip r:embed="rId11"/>
+                    <a:stretch>
+                      <a:fillRect/>
+                    </a:stretch>
+                  </pic:blipFill>
+                  <pic:spPr>
+                    <a:xfrm>
+                      <a:off x="0" y="0"/>
+                      <a:ext cx="3086367" cy="3962743"/>
                     </a:xfrm>
                     <a:prstGeom prst="rect">
                       <a:avLst/>
@@ -317,7 +390,7 @@
                     <pic:cNvPicPr/>
                   </pic:nvPicPr>
                   <pic:blipFill>
-                    <a:blip r:embed="rId10"/>
+                    <a:blip r:embed="rId12"/>
                     <a:stretch>
                       <a:fillRect/>
                     </a:stretch>
@@ -360,7 +433,7 @@
                     <pic:cNvPicPr/>
                   </pic:nvPicPr>
                   <pic:blipFill>
-                    <a:blip r:embed="rId7"/>
+                    <a:blip r:embed="rId8"/>
                     <a:stretch>
                       <a:fillRect/>
                     </a:stretch>
@@ -383,14 +456,29 @@
     </w:p>
     <w:p>
       <w:r>
-        <w:lastRenderedPageBreak/>
-        <w:t xml:space="preserve">Transmission constrained SW= solutionSW </w:t>
+        <w:t xml:space="preserve">Transmission constrained SW= </w:t>
+      </w:r>
+      <w:proofErr w:type="spellStart"/>
+      <w:r>
+        <w:t>solutionSW</w:t>
+      </w:r>
+      <w:proofErr w:type="spellEnd"/>
+      <w:r>
+        <w:t xml:space="preserve"> </w:t>
       </w:r>
       <w:r>
         <w:t>+</w:t>
       </w:r>
       <w:r>
-        <w:t xml:space="preserve"> Merchandasing Surplus</w:t>
+        <w:t xml:space="preserve"> </w:t>
+      </w:r>
+      <w:proofErr w:type="spellStart"/>
+      <w:r>
+        <w:t>Merchandasing</w:t>
+      </w:r>
+      <w:proofErr w:type="spellEnd"/>
+      <w:r>
+        <w:t xml:space="preserve"> Surplus</w:t>
       </w:r>
       <w:r>
         <w:t xml:space="preserve"> = 8+8??</w:t>

</xml_diff>